<commit_message>
social worker detail pdf added
</commit_message>
<xml_diff>
--- a/social_worker_module/Social_worker_module.docx
+++ b/social_worker_module/Social_worker_module.docx
@@ -62,6 +62,16 @@
         </w:drawing>
       </w:r>
     </w:p>
+    <w:p/>
+    <w:p/>
+    <w:p/>
+    <w:p/>
+    <w:p/>
+    <w:p>
+      <w:r>
+        <w:t>Registration for social worker</w:t>
+      </w:r>
+    </w:p>
     <w:p>
       <w:pPr>
         <w:spacing w:before="100" w:beforeAutospacing="1" w:after="100" w:afterAutospacing="1" w:line="240" w:lineRule="auto"/>
@@ -167,7 +177,7 @@
           <w:szCs w:val="20"/>
         </w:rPr>
         <w:pict w14:anchorId="77988C10">
-          <v:rect id="_x0000_i1027" style="width:0;height:1.5pt" o:hralign="center" o:hrstd="t" o:hr="t" fillcolor="#a0a0a0" stroked="f"/>
+          <v:rect id="_x0000_i1025" style="width:0;height:1.5pt" o:hralign="center" o:hrstd="t" o:hr="t" fillcolor="#a0a0a0" stroked="f"/>
         </w:pict>
       </w:r>
     </w:p>
@@ -191,7 +201,6 @@
           <w:sz w:val="20"/>
           <w:szCs w:val="20"/>
         </w:rPr>
-        <w:lastRenderedPageBreak/>
         <w:t>2. Dashboard</w:t>
       </w:r>
     </w:p>
@@ -317,7 +326,7 @@
           <w:szCs w:val="20"/>
         </w:rPr>
         <w:pict w14:anchorId="324246A9">
-          <v:rect id="_x0000_i1028" style="width:0;height:1.5pt" o:hralign="center" o:hrstd="t" o:hr="t" fillcolor="#a0a0a0" stroked="f"/>
+          <v:rect id="_x0000_i1026" style="width:0;height:1.5pt" o:hralign="center" o:hrstd="t" o:hr="t" fillcolor="#a0a0a0" stroked="f"/>
         </w:pict>
       </w:r>
     </w:p>
@@ -528,7 +537,7 @@
           <w:szCs w:val="20"/>
         </w:rPr>
         <w:pict w14:anchorId="339D9D2F">
-          <v:rect id="_x0000_i1029" style="width:0;height:1.5pt" o:hralign="center" o:hrstd="t" o:hr="t" fillcolor="#a0a0a0" stroked="f"/>
+          <v:rect id="_x0000_i1027" style="width:0;height:1.5pt" o:hralign="center" o:hrstd="t" o:hr="t" fillcolor="#a0a0a0" stroked="f"/>
         </w:pict>
       </w:r>
     </w:p>
@@ -877,8 +886,9 @@
           <w:sz w:val="20"/>
           <w:szCs w:val="20"/>
         </w:rPr>
+        <w:lastRenderedPageBreak/>
         <w:pict w14:anchorId="40A3DB1B">
-          <v:rect id="_x0000_i1030" style="width:0;height:1.5pt" o:hralign="center" o:hrstd="t" o:hr="t" fillcolor="#a0a0a0" stroked="f"/>
+          <v:rect id="_x0000_i1028" style="width:0;height:1.5pt" o:hralign="center" o:hrstd="t" o:hr="t" fillcolor="#a0a0a0" stroked="f"/>
         </w:pict>
       </w:r>
     </w:p>
@@ -1048,7 +1058,6 @@
           <w:sz w:val="20"/>
           <w:szCs w:val="20"/>
         </w:rPr>
-        <w:lastRenderedPageBreak/>
         <w:t>Actions:</w:t>
       </w:r>
     </w:p>
@@ -1112,7 +1121,7 @@
           <w:szCs w:val="20"/>
         </w:rPr>
         <w:pict w14:anchorId="69197C23">
-          <v:rect id="_x0000_i1031" style="width:0;height:1.5pt" o:hralign="center" o:hrstd="t" o:hr="t" fillcolor="#a0a0a0" stroked="f"/>
+          <v:rect id="_x0000_i1029" style="width:0;height:1.5pt" o:hralign="center" o:hrstd="t" o:hr="t" fillcolor="#a0a0a0" stroked="f"/>
         </w:pict>
       </w:r>
     </w:p>
@@ -1279,7 +1288,7 @@
           <w:szCs w:val="20"/>
         </w:rPr>
         <w:pict w14:anchorId="11BC490C">
-          <v:rect id="_x0000_i1032" style="width:0;height:1.5pt" o:hralign="center" o:hrstd="t" o:hr="t" fillcolor="#a0a0a0" stroked="f"/>
+          <v:rect id="_x0000_i1030" style="width:0;height:1.5pt" o:hralign="center" o:hrstd="t" o:hr="t" fillcolor="#a0a0a0" stroked="f"/>
         </w:pict>
       </w:r>
     </w:p>
@@ -1488,7 +1497,7 @@
           <w:szCs w:val="20"/>
         </w:rPr>
         <w:pict w14:anchorId="7F4B0E46">
-          <v:rect id="_x0000_i1033" style="width:0;height:1.5pt" o:hralign="center" o:hrstd="t" o:hr="t" fillcolor="#a0a0a0" stroked="f"/>
+          <v:rect id="_x0000_i1031" style="width:0;height:1.5pt" o:hralign="center" o:hrstd="t" o:hr="t" fillcolor="#a0a0a0" stroked="f"/>
         </w:pict>
       </w:r>
     </w:p>
@@ -1678,7 +1687,7 @@
           <w:szCs w:val="20"/>
         </w:rPr>
         <w:pict w14:anchorId="7D6F871E">
-          <v:rect id="_x0000_i1034" style="width:0;height:1.5pt" o:hralign="center" o:hrstd="t" o:hr="t" fillcolor="#a0a0a0" stroked="f"/>
+          <v:rect id="_x0000_i1032" style="width:0;height:1.5pt" o:hralign="center" o:hrstd="t" o:hr="t" fillcolor="#a0a0a0" stroked="f"/>
         </w:pict>
       </w:r>
     </w:p>
@@ -1702,6 +1711,7 @@
           <w:sz w:val="20"/>
           <w:szCs w:val="20"/>
         </w:rPr>
+        <w:lastRenderedPageBreak/>
         <w:t>Financial Stability</w:t>
       </w:r>
     </w:p>
@@ -1787,7 +1797,7 @@
           <w:szCs w:val="20"/>
         </w:rPr>
         <w:pict w14:anchorId="3A9F751F">
-          <v:rect id="_x0000_i1035" style="width:0;height:1.5pt" o:hralign="center" o:hrstd="t" o:hr="t" fillcolor="#a0a0a0" stroked="f"/>
+          <v:rect id="_x0000_i1033" style="width:0;height:1.5pt" o:hralign="center" o:hrstd="t" o:hr="t" fillcolor="#a0a0a0" stroked="f"/>
         </w:pict>
       </w:r>
     </w:p>
@@ -1855,7 +1865,6 @@
           <w:sz w:val="20"/>
           <w:szCs w:val="20"/>
         </w:rPr>
-        <w:lastRenderedPageBreak/>
         <w:t xml:space="preserve">Good </w:t>
       </w:r>
     </w:p>
@@ -1919,7 +1928,7 @@
           <w:szCs w:val="20"/>
         </w:rPr>
         <w:pict w14:anchorId="125CFD68">
-          <v:rect id="_x0000_i1036" style="width:0;height:1.5pt" o:hralign="center" o:hrstd="t" o:hr="t" fillcolor="#a0a0a0" stroked="f"/>
+          <v:rect id="_x0000_i1034" style="width:0;height:1.5pt" o:hralign="center" o:hrstd="t" o:hr="t" fillcolor="#a0a0a0" stroked="f"/>
         </w:pict>
       </w:r>
     </w:p>
@@ -1992,7 +2001,7 @@
           <w:szCs w:val="20"/>
         </w:rPr>
         <w:pict w14:anchorId="14723BC7">
-          <v:rect id="_x0000_i1037" style="width:0;height:1.5pt" o:hralign="center" o:hrstd="t" o:hr="t" fillcolor="#a0a0a0" stroked="f"/>
+          <v:rect id="_x0000_i1035" style="width:0;height:1.5pt" o:hralign="center" o:hrstd="t" o:hr="t" fillcolor="#a0a0a0" stroked="f"/>
         </w:pict>
       </w:r>
     </w:p>
@@ -2055,7 +2064,7 @@
           <w:szCs w:val="20"/>
         </w:rPr>
         <w:pict w14:anchorId="7D6BEF38">
-          <v:rect id="_x0000_i1038" style="width:0;height:1.5pt" o:hralign="center" o:hrstd="t" o:hr="t" fillcolor="#a0a0a0" stroked="f"/>
+          <v:rect id="_x0000_i1036" style="width:0;height:1.5pt" o:hralign="center" o:hrstd="t" o:hr="t" fillcolor="#a0a0a0" stroked="f"/>
         </w:pict>
       </w:r>
     </w:p>
@@ -2164,7 +2173,7 @@
           <w:szCs w:val="20"/>
         </w:rPr>
         <w:pict w14:anchorId="30C544CF">
-          <v:rect id="_x0000_i1039" style="width:0;height:1.5pt" o:hralign="center" o:hrstd="t" o:hr="t" fillcolor="#a0a0a0" stroked="f"/>
+          <v:rect id="_x0000_i1037" style="width:0;height:1.5pt" o:hralign="center" o:hrstd="t" o:hr="t" fillcolor="#a0a0a0" stroked="f"/>
         </w:pict>
       </w:r>
     </w:p>
@@ -2227,7 +2236,7 @@
           <w:szCs w:val="20"/>
         </w:rPr>
         <w:pict w14:anchorId="1AED90A5">
-          <v:rect id="_x0000_i1040" style="width:0;height:1.5pt" o:hralign="center" o:hrstd="t" o:hr="t" fillcolor="#a0a0a0" stroked="f"/>
+          <v:rect id="_x0000_i1038" style="width:0;height:1.5pt" o:hralign="center" o:hrstd="t" o:hr="t" fillcolor="#a0a0a0" stroked="f"/>
         </w:pict>
       </w:r>
     </w:p>
@@ -2332,7 +2341,7 @@
           <w:szCs w:val="20"/>
         </w:rPr>
         <w:pict w14:anchorId="26D2BC72">
-          <v:rect id="_x0000_i1041" style="width:0;height:1.5pt" o:hralign="center" o:hrstd="t" o:hr="t" fillcolor="#a0a0a0" stroked="f"/>
+          <v:rect id="_x0000_i1039" style="width:0;height:1.5pt" o:hralign="center" o:hrstd="t" o:hr="t" fillcolor="#a0a0a0" stroked="f"/>
         </w:pict>
       </w:r>
     </w:p>
@@ -2480,6 +2489,7 @@
           <w:sz w:val="20"/>
           <w:szCs w:val="20"/>
         </w:rPr>
+        <w:lastRenderedPageBreak/>
         <w:t>Action:</w:t>
       </w:r>
     </w:p>

</xml_diff>